<commit_message>
Milestone: SysML relations and signal connections demo on snapshot 5eaf843e
Capture shared relation/status views, historical snapshot routing, IPOS operational and reporting fixes, tests, approved working authority state, generated model/document evidence, and local handoff notes.

Verified scope: 315 affected/focused tests passed earlier; user Stage 6 and traceability/hierarchy refreshes completed with exit 0; eight selected-snapshot digital document checks passed. Snapshot: snap-73c872b1307b6adb5eaf843e. This milestone save does not rerun generation or certify final SysML implementation readiness. Current readiness evidence remains NOT_READY/NOT_ASSESSED as recorded.

Known unapplied follow-ups: Tk ThemeChanged test teardown cleanup and automatic DOCX/XLSX reopening on GUI refresh. Personal settings, source drafts, experimental proof directories, caches, lock files and local backup ZIPs are excluded.
</commit_message>
<xml_diff>
--- a/artifacts/stage6_digital_ipos/blocks/adsp/digital_ipos_adsp.docx
+++ b/artifacts/stage6_digital_ipos/blocks/adsp/digital_ipos_adsp.docx
@@ -2,7 +2,7 @@
 <file path=word/document.xml><?xml version="1.0" encoding="utf-8"?>
 <w:document xmlns:r="http://schemas.openxmlformats.org/officeDocument/2006/relationships" xmlns:w="http://schemas.openxmlformats.org/wordprocessingml/2006/main">
   <w:body>
-    <w:bookmarkStart w:id="56" w:name="digital-ipos---adsp"/>
+    <w:bookmarkStart w:id="59" w:name="digital-ipos---adsp"/>
     <w:p>
       <w:pPr>
         <w:pStyle w:val="Heading1"/>
@@ -44,7 +44,7 @@
         <w:t xml:space="preserve">Author: Alessandro Lucio IANNUZZI</w:t>
       </w:r>
     </w:p>
-    <w:bookmarkStart w:id="30" w:name="X00c53f9efd41cb60267e5a6c5d324e4b2a19070"/>
+    <w:bookmarkStart w:id="32" w:name="X00c53f9efd41cb60267e5a6c5d324e4b2a19070"/>
     <w:p>
       <w:r>
         <w:br w:type="page"/>
@@ -61,18 +61,6 @@
           <w:bCs/>
         </w:rPr>
         <w:t xml:space="preserve">0.1 Table of contents</w:t>
-      </w:r>
-    </w:p>
-    <w:p>
-      <w:pPr>
-        <w:pStyle w:val="Heading2"/>
-      </w:pPr>
-      <w:r>
-        <w:rPr>
-          <w:b/>
-          <w:bCs/>
-        </w:rPr>
-        <w:t xml:space="preserve">0. Document Navigation</w:t>
       </w:r>
     </w:p>
     <w:p>
@@ -100,6 +88,57 @@
           <w:numId w:val="1002"/>
         </w:numPr>
       </w:pPr>
+      <w:hyperlink w:anchor="X6d66c9b48e69b901b65edad7ce11cc7034d8fc0">
+        <w:r>
+          <w:rPr>
+            <w:rStyle w:val="Hyperlink"/>
+          </w:rPr>
+          <w:t xml:space="preserve">1.1 Functionality</w:t>
+        </w:r>
+      </w:hyperlink>
+    </w:p>
+    <w:p>
+      <w:pPr>
+        <w:pStyle w:val="Compact"/>
+        <w:numPr>
+          <w:ilvl w:val="0"/>
+          <w:numId w:val="1002"/>
+        </w:numPr>
+      </w:pPr>
+      <w:hyperlink w:anchor="X42b8cbdc8caad2683370f94443bf78397253609">
+        <w:r>
+          <w:rPr>
+            <w:rStyle w:val="Hyperlink"/>
+          </w:rPr>
+          <w:t xml:space="preserve">1.2 Supported functions and scope</w:t>
+        </w:r>
+      </w:hyperlink>
+    </w:p>
+    <w:p>
+      <w:pPr>
+        <w:pStyle w:val="Compact"/>
+        <w:numPr>
+          <w:ilvl w:val="0"/>
+          <w:numId w:val="1002"/>
+        </w:numPr>
+      </w:pPr>
+      <w:hyperlink w:anchor="Xeb78ecc8712b6b637c6daa69cd9e6db05c17857">
+        <w:r>
+          <w:rPr>
+            <w:rStyle w:val="Hyperlink"/>
+          </w:rPr>
+          <w:t xml:space="preserve">1.4 Supported block functions</w:t>
+        </w:r>
+      </w:hyperlink>
+    </w:p>
+    <w:p>
+      <w:pPr>
+        <w:pStyle w:val="Compact"/>
+        <w:numPr>
+          <w:ilvl w:val="0"/>
+          <w:numId w:val="1002"/>
+        </w:numPr>
+      </w:pPr>
       <w:hyperlink w:anchor="Xf07349b071768f65482c37a14b234476b9dae7d">
         <w:r>
           <w:rPr>
@@ -128,6 +167,18 @@
     </w:p>
     <w:bookmarkEnd w:id="26"/>
     <w:bookmarkStart w:id="28" w:name="X18145283a8c0d2c05dde288ce51f5c2d1700173"/>
+    <w:p>
+      <w:pPr>
+        <w:pStyle w:val="Heading2"/>
+      </w:pPr>
+      <w:r>
+        <w:rPr>
+          <w:b/>
+          <w:bCs/>
+        </w:rPr>
+        <w:t xml:space="preserve">0. Document Navigation</w:t>
+      </w:r>
+    </w:p>
     <w:p>
       <w:pPr>
         <w:pStyle w:val="Heading3"/>
@@ -318,7 +369,7 @@
     </w:tbl>
     <w:bookmarkEnd w:id="27"/>
     <w:bookmarkEnd w:id="28"/>
-    <w:bookmarkStart w:id="29" w:name="X529afff74b9e1e7f50a5ce03a4a23f6a9561e17"/>
+    <w:bookmarkStart w:id="30" w:name="X529afff74b9e1e7f50a5ce03a4a23f6a9561e17"/>
     <w:p>
       <w:pPr>
         <w:pStyle w:val="Heading3"/>
@@ -329,6 +380,19 @@
           <w:bCs/>
         </w:rPr>
         <w:t xml:space="preserve">0.3 Requirement navigation</w:t>
+      </w:r>
+    </w:p>
+    <w:bookmarkStart w:id="29" w:name="table-2-requirement-navigation"/>
+    <w:p>
+      <w:pPr>
+        <w:pStyle w:val="Heading4"/>
+      </w:pPr>
+      <w:r>
+        <w:rPr>
+          <w:b/>
+          <w:bCs/>
+        </w:rPr>
+        <w:t xml:space="preserve">Table 2. Requirement navigation</w:t>
       </w:r>
     </w:p>
     <w:tbl>
@@ -930,7 +994,73 @@
     </w:tbl>
     <w:bookmarkEnd w:id="29"/>
     <w:bookmarkEnd w:id="30"/>
-    <w:bookmarkStart w:id="34" w:name="Xe4ae1f4c6c1148d24765132f87dc7acea3c515f"/>
+    <w:bookmarkStart w:id="31" w:name="Xae25189eb88f8aa82824f86c23f407e5c67a35a"/>
+    <w:p>
+      <w:pPr>
+        <w:pStyle w:val="Heading3"/>
+      </w:pPr>
+      <w:r>
+        <w:rPr>
+          <w:b/>
+          <w:bCs/>
+        </w:rPr>
+        <w:t xml:space="preserve">0.4 Table index</w:t>
+      </w:r>
+    </w:p>
+    <w:p>
+      <w:pPr>
+        <w:pStyle w:val="Compact"/>
+        <w:numPr>
+          <w:ilvl w:val="0"/>
+          <w:numId w:val="1003"/>
+        </w:numPr>
+      </w:pPr>
+      <w:hyperlink w:anchor="table-1-version-history">
+        <w:r>
+          <w:rPr>
+            <w:rStyle w:val="Hyperlink"/>
+          </w:rPr>
+          <w:t xml:space="preserve">Table 1. Version history</w:t>
+        </w:r>
+      </w:hyperlink>
+    </w:p>
+    <w:p>
+      <w:pPr>
+        <w:pStyle w:val="Compact"/>
+        <w:numPr>
+          <w:ilvl w:val="0"/>
+          <w:numId w:val="1003"/>
+        </w:numPr>
+      </w:pPr>
+      <w:hyperlink w:anchor="table-2-requirement-navigation">
+        <w:r>
+          <w:rPr>
+            <w:rStyle w:val="Hyperlink"/>
+          </w:rPr>
+          <w:t xml:space="preserve">Table 2. Requirement navigation</w:t>
+        </w:r>
+      </w:hyperlink>
+    </w:p>
+    <w:p>
+      <w:pPr>
+        <w:pStyle w:val="Compact"/>
+        <w:numPr>
+          <w:ilvl w:val="0"/>
+          <w:numId w:val="1003"/>
+        </w:numPr>
+      </w:pPr>
+      <w:hyperlink w:anchor="table-3-source-io">
+        <w:r>
+          <w:rPr>
+            <w:rStyle w:val="Hyperlink"/>
+          </w:rPr>
+          <w:t xml:space="preserve">Table 3. Source I/O</w:t>
+        </w:r>
+      </w:hyperlink>
+    </w:p>
+    <w:bookmarkEnd w:id="31"/>
+    <w:bookmarkEnd w:id="32"/>
+    <w:bookmarkStart w:id="36" w:name="Xe4ae1f4c6c1148d24765132f87dc7acea3c515f"/>
     <w:p>
       <w:pPr>
         <w:pStyle w:val="Heading2"/>
@@ -943,7 +1073,7 @@
         <w:t xml:space="preserve">1. Block overview</w:t>
       </w:r>
     </w:p>
-    <w:bookmarkStart w:id="31" w:name="X6d66c9b48e69b901b65edad7ce11cc7034d8fc0"/>
+    <w:bookmarkStart w:id="33" w:name="X6d66c9b48e69b901b65edad7ce11cc7034d8fc0"/>
     <w:p>
       <w:pPr>
         <w:pStyle w:val="Heading3"/>
@@ -964,8 +1094,8 @@
         <w:t xml:space="preserve">The ADSP block is designed to execute ADSP firmware for OTP boot/write/test and signal elaboration, using mapped program/data/register memory and soft-reset handling.</w:t>
       </w:r>
     </w:p>
-    <w:bookmarkEnd w:id="31"/>
-    <w:bookmarkStart w:id="32" w:name="X42b8cbdc8caad2683370f94443bf78397253609"/>
+    <w:bookmarkEnd w:id="33"/>
+    <w:bookmarkStart w:id="34" w:name="X42b8cbdc8caad2683370f94443bf78397253609"/>
     <w:p>
       <w:pPr>
         <w:pStyle w:val="Heading3"/>
@@ -986,8 +1116,8 @@
         <w:t xml:space="preserve">The ADSP block accepts Acquired samples and configuration data and produces Elaborated signal data and metadata.</w:t>
       </w:r>
     </w:p>
-    <w:bookmarkEnd w:id="32"/>
-    <w:bookmarkStart w:id="33" w:name="Xeb78ecc8712b6b637c6daa69cd9e6db05c17857"/>
+    <w:bookmarkEnd w:id="34"/>
+    <w:bookmarkStart w:id="35" w:name="Xeb78ecc8712b6b637c6daa69cd9e6db05c17857"/>
     <w:p>
       <w:pPr>
         <w:pStyle w:val="Heading3"/>
@@ -1005,7 +1135,7 @@
         <w:pStyle w:val="FirstParagraph"/>
       </w:pPr>
       <w:r>
-        <w:t xml:space="preserve">OTP_WRITE, OTP_BOOT and OTP_TEST bits are cleared by ADSP at the end of their respective operation.</w:t>
+        <w:t xml:space="preserve">After startup phase, once started with an operation, the IP ignores any further start incoming transactions.</w:t>
       </w:r>
     </w:p>
     <w:p>
@@ -1013,7 +1143,7 @@
         <w:pStyle w:val="BodyText"/>
       </w:pPr>
       <w:r>
-        <w:t xml:space="preserve">OTP_IREF_WAKEUP is set to one by an external I2C/SPI to AHB write before initiating a new OTP_TEST or OTP_WRITE operation and is setted to zero by an external I2C/SPI to AHB write at the end of OTP_TEST or OTP_WRITE operation.</w:t>
+        <w:t xml:space="preserve">During the Soft Reset routine, ADSP writes the ADSP RAM with the value 0.</w:t>
       </w:r>
     </w:p>
     <w:p>
@@ -1021,140 +1151,12 @@
         <w:pStyle w:val="BodyText"/>
       </w:pPr>
       <w:r>
-        <w:t xml:space="preserve">During WRITE routine, ADSP allows copying all OTP Registers into the OTP Memory only if the location 0x24 of OTP Memory (OTP[24] in the following diagram) is not set to 0xFF and copies the content of the OTP regmap into the OTP memory, following the procedure to burn the fuses as expressed in the OTP datasheet.</w:t>
-      </w:r>
-    </w:p>
-    <w:p>
-      <w:pPr>
-        <w:pStyle w:val="BodyText"/>
-      </w:pPr>
-      <w:r>
-        <w:t xml:space="preserve">A new operation starts only when quokka_run is low, and one between OTP_TEST bit, OTP_WRITE bit or OTP_BOOT bit is written to 1.</w:t>
-      </w:r>
-    </w:p>
-    <w:p>
-      <w:pPr>
-        <w:pStyle w:val="BodyText"/>
-      </w:pPr>
-      <w:r>
-        <w:t xml:space="preserve">After startup phase, once started with an operation, the IP ignores any further start incoming transactions.</w:t>
-      </w:r>
-    </w:p>
-    <w:p>
-      <w:pPr>
-        <w:pStyle w:val="BodyText"/>
-      </w:pPr>
-      <w:r>
-        <w:t xml:space="preserve">During the Soft Reset routine, ADSP writes the ADSP RAM with the value 0.</w:t>
-      </w:r>
-    </w:p>
-    <w:p>
-      <w:pPr>
-        <w:pStyle w:val="BodyText"/>
-      </w:pPr>
-      <w:r>
-        <w:t xml:space="preserve">Only the first 3.5Kbyte of ADSP RAM is cleared, from address 0x000 to address 0xDFF.</w:t>
-      </w:r>
-    </w:p>
-    <w:p>
-      <w:pPr>
-        <w:pStyle w:val="BodyText"/>
-      </w:pPr>
-      <w:r>
-        <w:t xml:space="preserve">During OTP boot operation, the ADSP copies the content of the OTP memory into the OTP registers, following the procedure to access OTP memory.</w:t>
-      </w:r>
-    </w:p>
-    <w:p>
-      <w:pPr>
-        <w:pStyle w:val="BodyText"/>
-      </w:pPr>
-      <w:r>
-        <w:t xml:space="preserve">The BOOT routine starts when the OTP_BOOT bit rises and completes when quokka_boot_end rises.</w:t>
-      </w:r>
-    </w:p>
-    <w:p>
-      <w:pPr>
-        <w:pStyle w:val="BodyText"/>
-      </w:pPr>
-      <w:r>
-        <w:t xml:space="preserve">During the WRITE routine and after copying all OTP Registers into the OTP Memory, ADSP compares each value inside the OTP memory with the corresponding value in OTP Registers to check if the WRITE routine has been succesfull. If the WRITE routine has been succesfull, ADSP writes 0xFF into the last location of the OTP memory.</w:t>
-      </w:r>
-    </w:p>
-    <w:p>
-      <w:pPr>
-        <w:pStyle w:val="BodyText"/>
-      </w:pPr>
-      <w:r>
-        <w:t xml:space="preserve">During BOOT routine, ADSP first reads the last location of the OTP memory, at address 0x7F.</w:t>
-      </w:r>
-    </w:p>
-    <w:p>
-      <w:pPr>
-        <w:pStyle w:val="BodyText"/>
-      </w:pPr>
-      <w:r>
-        <w:t xml:space="preserve">If the content is 0xFF, called “lifecycle” byte, then the READ operation proceeds from address 0 to address 0x2F; otherwise, ADSP does not perform any further reads.</w:t>
-      </w:r>
-    </w:p>
-    <w:p>
-      <w:pPr>
-        <w:pStyle w:val="BodyText"/>
-      </w:pPr>
-      <w:r>
-        <w:t xml:space="preserve">The WRITE routine starts when OTP Write Bit rises and completes when quokka_run falls.</w:t>
-      </w:r>
-    </w:p>
-    <w:p>
-      <w:pPr>
-        <w:pStyle w:val="BodyText"/>
-      </w:pPr>
-      <w:r>
-        <w:t xml:space="preserve">If during the start of a new operation, more than one bit is written into CONTROL_A reg in the same write operation, ADSP executes only the routine at higher priority and discard the others. The priority order is 1: SOFT RESET routine, 2: OTP WRITE routine, 3: OTP TEST routine and 4: OTP BOOT routine , from higher to lower priority.</w:t>
-      </w:r>
-    </w:p>
-    <w:p>
-      <w:pPr>
-        <w:pStyle w:val="BodyText"/>
-      </w:pPr>
-      <w:r>
         <w:t xml:space="preserve">To move OTP signal, ADSP writes a new value in a regbank by AHB protocol.</w:t>
       </w:r>
     </w:p>
-    <w:p>
-      <w:pPr>
-        <w:pStyle w:val="BodyText"/>
-      </w:pPr>
-      <w:r>
-        <w:t xml:space="preserve">The TEST routine starts when OTP Test Bit rises and completes when quokka_run falls.</w:t>
-      </w:r>
-    </w:p>
-    <w:p>
-      <w:pPr>
-        <w:pStyle w:val="BodyText"/>
-      </w:pPr>
-      <w:r>
-        <w:t xml:space="preserve">The Soft Reset routine starts when SOFT_RESET Bit (in CONTROL_A register) rises and completes when quokka_run falls.</w:t>
-      </w:r>
-    </w:p>
-    <w:p>
-      <w:pPr>
-        <w:pStyle w:val="BodyText"/>
-      </w:pPr>
-      <w:r>
-        <w:t xml:space="preserve">The TEST routines allows reading an 8-bit word on OTP of a specific address written in OTP_A register, and write this value in OTP_D_TEST register.</w:t>
-      </w:r>
-    </w:p>
-    <w:p>
-      <w:pPr>
-        <w:pStyle w:val="BodyText"/>
-      </w:pPr>
-      <w:r>
-        <w:t xml:space="preserve">To perform a BOOT routine, OTP_BOOT bit is written when quokka_run is low.</w:t>
-      </w:r>
-    </w:p>
-    <w:bookmarkEnd w:id="33"/>
-    <w:bookmarkEnd w:id="34"/>
-    <w:bookmarkStart w:id="35" w:name="Xf07349b071768f65482c37a14b234476b9dae7d"/>
+    <w:bookmarkEnd w:id="35"/>
+    <w:bookmarkEnd w:id="36"/>
+    <w:bookmarkStart w:id="38" w:name="Xf07349b071768f65482c37a14b234476b9dae7d"/>
     <w:p>
       <w:pPr>
         <w:pStyle w:val="Heading2"/>
@@ -1173,6 +1175,19 @@
       </w:pPr>
       <w:r>
         <w:t xml:space="preserve">The following approved source I/O entries are owned by this block.</w:t>
+      </w:r>
+    </w:p>
+    <w:bookmarkStart w:id="37" w:name="table-3-source-io"/>
+    <w:p>
+      <w:pPr>
+        <w:pStyle w:val="Heading4"/>
+      </w:pPr>
+      <w:r>
+        <w:rPr>
+          <w:b/>
+          <w:bCs/>
+        </w:rPr>
+        <w:t xml:space="preserve">Table 3. Source I/O</w:t>
       </w:r>
     </w:p>
     <w:tbl>
@@ -3766,8 +3781,9 @@
         </w:tc>
       </w:tr>
     </w:tbl>
-    <w:bookmarkEnd w:id="35"/>
-    <w:bookmarkStart w:id="55" w:name="X0f484274a9a50000ed4ab655b3924a3236627f6"/>
+    <w:bookmarkEnd w:id="37"/>
+    <w:bookmarkEnd w:id="38"/>
+    <w:bookmarkStart w:id="58" w:name="X0f484274a9a50000ed4ab655b3924a3236627f6"/>
     <w:p>
       <w:pPr>
         <w:pStyle w:val="Heading2"/>
@@ -3780,7 +3796,7 @@
         <w:t xml:space="preserve">3. Block requirements</w:t>
       </w:r>
     </w:p>
-    <w:bookmarkStart w:id="36" w:name="ipos-adsp-001"/>
+    <w:bookmarkStart w:id="39" w:name="ipos-adsp-001"/>
     <w:p>
       <w:pPr>
         <w:pStyle w:val="Heading4"/>
@@ -3794,9 +3810,6 @@
       </w:r>
     </w:p>
     <w:p>
-      <w:pPr>
-        <w:pStyle w:val="FirstParagraph"/>
-      </w:pPr>
       <w:r>
         <w:t xml:space="preserve">To move OTP signal, ADSP shall write a new value in a regbank by AHB protocol.</w:t>
       </w:r>
@@ -3817,8 +3830,8 @@
         <w:t xml:space="preserve">[End]</w:t>
       </w:r>
     </w:p>
-    <w:bookmarkEnd w:id="36"/>
-    <w:bookmarkStart w:id="37" w:name="ipos-adsp-002"/>
+    <w:bookmarkEnd w:id="39"/>
+    <w:bookmarkStart w:id="40" w:name="ipos-adsp-002"/>
     <w:p>
       <w:pPr>
         <w:pStyle w:val="Heading4"/>
@@ -3832,9 +3845,6 @@
       </w:r>
     </w:p>
     <w:p>
-      <w:pPr>
-        <w:pStyle w:val="FirstParagraph"/>
-      </w:pPr>
       <w:r>
         <w:t xml:space="preserve">The BOOT routine shall starts when the OTP_BOOT bit rises and shall completes when quokka_boot_end rises. [Vpriority High]</w:t>
       </w:r>
@@ -3855,8 +3865,8 @@
         <w:t xml:space="preserve">[End]</w:t>
       </w:r>
     </w:p>
-    <w:bookmarkEnd w:id="37"/>
-    <w:bookmarkStart w:id="38" w:name="ipos-adsp-003"/>
+    <w:bookmarkEnd w:id="40"/>
+    <w:bookmarkStart w:id="41" w:name="ipos-adsp-003"/>
     <w:p>
       <w:pPr>
         <w:pStyle w:val="Heading4"/>
@@ -3870,9 +3880,6 @@
       </w:r>
     </w:p>
     <w:p>
-      <w:pPr>
-        <w:pStyle w:val="FirstParagraph"/>
-      </w:pPr>
       <w:r>
         <w:t xml:space="preserve">During OTP boot operation, the ADSP shall copy the content of the OTP memory into the OTP registers, following the procedure to access OTP memory [Vpriority High]</w:t>
       </w:r>
@@ -3893,8 +3900,8 @@
         <w:t xml:space="preserve">[End]</w:t>
       </w:r>
     </w:p>
-    <w:bookmarkEnd w:id="38"/>
-    <w:bookmarkStart w:id="39" w:name="ipos-adsp-004"/>
+    <w:bookmarkEnd w:id="41"/>
+    <w:bookmarkStart w:id="42" w:name="ipos-adsp-004"/>
     <w:p>
       <w:pPr>
         <w:pStyle w:val="Heading4"/>
@@ -3908,9 +3915,6 @@
       </w:r>
     </w:p>
     <w:p>
-      <w:pPr>
-        <w:pStyle w:val="FirstParagraph"/>
-      </w:pPr>
       <w:r>
         <w:t xml:space="preserve">During BOOT routine, ADSP shall first read the last location of the OTP memory, at address 0x7F. If the content is 0xFF, called “lifecycle” byte, then the READ operation proceeds from address 0 to address 0x2F; otherwise, ADSP shall not perform any further reads.</w:t>
       </w:r>
@@ -3931,8 +3935,8 @@
         <w:t xml:space="preserve">[End]</w:t>
       </w:r>
     </w:p>
-    <w:bookmarkEnd w:id="39"/>
-    <w:bookmarkStart w:id="40" w:name="ipos-adsp-005"/>
+    <w:bookmarkEnd w:id="42"/>
+    <w:bookmarkStart w:id="43" w:name="ipos-adsp-005"/>
     <w:p>
       <w:pPr>
         <w:pStyle w:val="Heading4"/>
@@ -3946,9 +3950,6 @@
       </w:r>
     </w:p>
     <w:p>
-      <w:pPr>
-        <w:pStyle w:val="FirstParagraph"/>
-      </w:pPr>
       <w:r>
         <w:t xml:space="preserve">To perform a BOOT routine, OTP_BOOT bit shall be written when quokka_run is low. [Vpriority High]</w:t>
       </w:r>
@@ -3969,8 +3970,8 @@
         <w:t xml:space="preserve">[End]</w:t>
       </w:r>
     </w:p>
-    <w:bookmarkEnd w:id="40"/>
-    <w:bookmarkStart w:id="41" w:name="ipos-adsp-006"/>
+    <w:bookmarkEnd w:id="43"/>
+    <w:bookmarkStart w:id="44" w:name="ipos-adsp-006"/>
     <w:p>
       <w:pPr>
         <w:pStyle w:val="Heading4"/>
@@ -3984,9 +3985,6 @@
       </w:r>
     </w:p>
     <w:p>
-      <w:pPr>
-        <w:pStyle w:val="FirstParagraph"/>
-      </w:pPr>
       <w:r>
         <w:t xml:space="preserve">The WRITE routine shall start when OTP Write Bit rises and completes when quokka_run falls. [Vpriority High]</w:t>
       </w:r>
@@ -4007,8 +4005,8 @@
         <w:t xml:space="preserve">[End]</w:t>
       </w:r>
     </w:p>
-    <w:bookmarkEnd w:id="41"/>
-    <w:bookmarkStart w:id="42" w:name="ipos-adsp-007"/>
+    <w:bookmarkEnd w:id="44"/>
+    <w:bookmarkStart w:id="45" w:name="ipos-adsp-007"/>
     <w:p>
       <w:pPr>
         <w:pStyle w:val="Heading4"/>
@@ -4022,9 +4020,6 @@
       </w:r>
     </w:p>
     <w:p>
-      <w:pPr>
-        <w:pStyle w:val="FirstParagraph"/>
-      </w:pPr>
       <w:r>
         <w:t xml:space="preserve">During WRITE routine ADSP shall copy the content of the OTP regmap into the OTP memory, following the procedure to burn the fuses as expressed in the OTP datasheet [Vpriority High]</w:t>
       </w:r>
@@ -4045,8 +4040,8 @@
         <w:t xml:space="preserve">[End]</w:t>
       </w:r>
     </w:p>
-    <w:bookmarkEnd w:id="42"/>
-    <w:bookmarkStart w:id="43" w:name="ipos-adsp-008"/>
+    <w:bookmarkEnd w:id="45"/>
+    <w:bookmarkStart w:id="46" w:name="ipos-adsp-008"/>
     <w:p>
       <w:pPr>
         <w:pStyle w:val="Heading4"/>
@@ -4060,9 +4055,6 @@
       </w:r>
     </w:p>
     <w:p>
-      <w:pPr>
-        <w:pStyle w:val="FirstParagraph"/>
-      </w:pPr>
       <w:r>
         <w:t xml:space="preserve">During WRITE routine, ADSP shall allow copying all OTP Registers into the OTP Memory only if the location 0x24 of OTP Memory (OTP[24] in the following diagram) is not set to 0xFF.</w:t>
       </w:r>
@@ -4083,8 +4075,8 @@
         <w:t xml:space="preserve">[End]</w:t>
       </w:r>
     </w:p>
-    <w:bookmarkEnd w:id="43"/>
-    <w:bookmarkStart w:id="44" w:name="ipos-adsp-009"/>
+    <w:bookmarkEnd w:id="46"/>
+    <w:bookmarkStart w:id="47" w:name="ipos-adsp-009"/>
     <w:p>
       <w:pPr>
         <w:pStyle w:val="Heading4"/>
@@ -4098,9 +4090,6 @@
       </w:r>
     </w:p>
     <w:p>
-      <w:pPr>
-        <w:pStyle w:val="FirstParagraph"/>
-      </w:pPr>
       <w:r>
         <w:t xml:space="preserve">During the WRITE routine and after copying all OTP Registers into the OTP Memory, ADSP shall compare each value inside the OTP memory with the corresponding value in OTP Registers to check if the WRITE routine has been succesfull. In that case ADSP shall write 0xFF into the last location of the OTP memory.</w:t>
       </w:r>
@@ -4121,8 +4110,8 @@
         <w:t xml:space="preserve">[End]</w:t>
       </w:r>
     </w:p>
-    <w:bookmarkEnd w:id="44"/>
-    <w:bookmarkStart w:id="45" w:name="ipos-adsp-010"/>
+    <w:bookmarkEnd w:id="47"/>
+    <w:bookmarkStart w:id="48" w:name="ipos-adsp-010"/>
     <w:p>
       <w:pPr>
         <w:pStyle w:val="Heading4"/>
@@ -4136,9 +4125,6 @@
       </w:r>
     </w:p>
     <w:p>
-      <w:pPr>
-        <w:pStyle w:val="FirstParagraph"/>
-      </w:pPr>
       <w:r>
         <w:t xml:space="preserve">OTP_WRITE, OTP_BOOT and OTP_TEST bits shall be cleared by ADSP at the end of their respective operation [Vpriority High]</w:t>
       </w:r>
@@ -4159,8 +4145,8 @@
         <w:t xml:space="preserve">[End]</w:t>
       </w:r>
     </w:p>
-    <w:bookmarkEnd w:id="45"/>
-    <w:bookmarkStart w:id="46" w:name="ipos-adsp-011"/>
+    <w:bookmarkEnd w:id="48"/>
+    <w:bookmarkStart w:id="49" w:name="ipos-adsp-011"/>
     <w:p>
       <w:pPr>
         <w:pStyle w:val="Heading4"/>
@@ -4174,9 +4160,6 @@
       </w:r>
     </w:p>
     <w:p>
-      <w:pPr>
-        <w:pStyle w:val="FirstParagraph"/>
-      </w:pPr>
       <w:r>
         <w:t xml:space="preserve">A new operation shall start only when quokka_run is low, and one between OTP_TEST bit, OTP_WRITE bit or OTP_BOOT bit is written to 1 [Vpriority High]</w:t>
       </w:r>
@@ -4197,8 +4180,8 @@
         <w:t xml:space="preserve">[End]</w:t>
       </w:r>
     </w:p>
-    <w:bookmarkEnd w:id="46"/>
-    <w:bookmarkStart w:id="47" w:name="ipos-adsp-012"/>
+    <w:bookmarkEnd w:id="49"/>
+    <w:bookmarkStart w:id="50" w:name="ipos-adsp-012"/>
     <w:p>
       <w:pPr>
         <w:pStyle w:val="Heading4"/>
@@ -4212,9 +4195,6 @@
       </w:r>
     </w:p>
     <w:p>
-      <w:pPr>
-        <w:pStyle w:val="FirstParagraph"/>
-      </w:pPr>
       <w:r>
         <w:t xml:space="preserve">OTP_IREF_WAKEUP shall be set to one by an external I2C/SPI to AHB write before initiating a new OTP_TEST or OTP_WRITE operation [Vpriority High]</w:t>
       </w:r>
@@ -4235,8 +4215,8 @@
         <w:t xml:space="preserve">[End]</w:t>
       </w:r>
     </w:p>
-    <w:bookmarkEnd w:id="47"/>
-    <w:bookmarkStart w:id="48" w:name="ipos-adsp-013"/>
+    <w:bookmarkEnd w:id="50"/>
+    <w:bookmarkStart w:id="51" w:name="ipos-adsp-013"/>
     <w:p>
       <w:pPr>
         <w:pStyle w:val="Heading4"/>
@@ -4250,9 +4230,6 @@
       </w:r>
     </w:p>
     <w:p>
-      <w:pPr>
-        <w:pStyle w:val="FirstParagraph"/>
-      </w:pPr>
       <w:r>
         <w:t xml:space="preserve">OTP_IREF_WAKEUP shall be setted to zero by an external I2C/SPI to AHB write at the end of OTP_TEST or OTP_WRITE operation [Vpriority High]</w:t>
       </w:r>
@@ -4273,8 +4250,8 @@
         <w:t xml:space="preserve">[End]</w:t>
       </w:r>
     </w:p>
-    <w:bookmarkEnd w:id="48"/>
-    <w:bookmarkStart w:id="49" w:name="ipos-adsp-014"/>
+    <w:bookmarkEnd w:id="51"/>
+    <w:bookmarkStart w:id="52" w:name="ipos-adsp-014"/>
     <w:p>
       <w:pPr>
         <w:pStyle w:val="Heading4"/>
@@ -4288,9 +4265,6 @@
       </w:r>
     </w:p>
     <w:p>
-      <w:pPr>
-        <w:pStyle w:val="FirstParagraph"/>
-      </w:pPr>
       <w:r>
         <w:t xml:space="preserve">After startup phase, once started with an operation, the IP shall ignore any further start incoming transactions. [Vpriority High]</w:t>
       </w:r>
@@ -4311,8 +4285,8 @@
         <w:t xml:space="preserve">[End]</w:t>
       </w:r>
     </w:p>
-    <w:bookmarkEnd w:id="49"/>
-    <w:bookmarkStart w:id="50" w:name="ipos-adsp-015"/>
+    <w:bookmarkEnd w:id="52"/>
+    <w:bookmarkStart w:id="53" w:name="ipos-adsp-015"/>
     <w:p>
       <w:pPr>
         <w:pStyle w:val="Heading4"/>
@@ -4326,9 +4300,6 @@
       </w:r>
     </w:p>
     <w:p>
-      <w:pPr>
-        <w:pStyle w:val="FirstParagraph"/>
-      </w:pPr>
       <w:r>
         <w:t xml:space="preserve">The TEST routine shall start when OTP Test Bit rises and completes when quokka_run falls. [Vpriority High]</w:t>
       </w:r>
@@ -4349,8 +4320,8 @@
         <w:t xml:space="preserve">[End]</w:t>
       </w:r>
     </w:p>
-    <w:bookmarkEnd w:id="50"/>
-    <w:bookmarkStart w:id="51" w:name="ipos-adsp-016"/>
+    <w:bookmarkEnd w:id="53"/>
+    <w:bookmarkStart w:id="54" w:name="ipos-adsp-016"/>
     <w:p>
       <w:pPr>
         <w:pStyle w:val="Heading4"/>
@@ -4364,9 +4335,6 @@
       </w:r>
     </w:p>
     <w:p>
-      <w:pPr>
-        <w:pStyle w:val="FirstParagraph"/>
-      </w:pPr>
       <w:r>
         <w:t xml:space="preserve">[DDS_STBIO1_0028] Requirement: The TEST routines shall allow reading an 8-bit word on OTP of a specific address written in OTP_A register, and write this value in OTP_D_TEST register.</w:t>
       </w:r>
@@ -4387,8 +4355,8 @@
         <w:t xml:space="preserve">[End]</w:t>
       </w:r>
     </w:p>
-    <w:bookmarkEnd w:id="51"/>
-    <w:bookmarkStart w:id="52" w:name="ipos-adsp-017"/>
+    <w:bookmarkEnd w:id="54"/>
+    <w:bookmarkStart w:id="55" w:name="ipos-adsp-017"/>
     <w:p>
       <w:pPr>
         <w:pStyle w:val="Heading4"/>
@@ -4402,9 +4370,6 @@
       </w:r>
     </w:p>
     <w:p>
-      <w:pPr>
-        <w:pStyle w:val="FirstParagraph"/>
-      </w:pPr>
       <w:r>
         <w:t xml:space="preserve">The Soft Reset routine shall start when SOFT_RESET Bit (in CONTROL_A register) rises and completes when quokka_run falls. [Vpriority High]</w:t>
       </w:r>
@@ -4425,8 +4390,8 @@
         <w:t xml:space="preserve">[End]</w:t>
       </w:r>
     </w:p>
-    <w:bookmarkEnd w:id="52"/>
-    <w:bookmarkStart w:id="53" w:name="ipos-adsp-018"/>
+    <w:bookmarkEnd w:id="55"/>
+    <w:bookmarkStart w:id="56" w:name="ipos-adsp-018"/>
     <w:p>
       <w:pPr>
         <w:pStyle w:val="Heading4"/>
@@ -4440,9 +4405,6 @@
       </w:r>
     </w:p>
     <w:p>
-      <w:pPr>
-        <w:pStyle w:val="FirstParagraph"/>
-      </w:pPr>
       <w:r>
         <w:t xml:space="preserve">During the Soft Reset routine, ADSP shall write the ADSP RAM with the value 0. Only the first 3.5Kbyte of ADSP RAM shall be cleared, from address 0x000 to address 0xDFF [Vpriority High]</w:t>
       </w:r>
@@ -4463,8 +4425,8 @@
         <w:t xml:space="preserve">[End]</w:t>
       </w:r>
     </w:p>
-    <w:bookmarkEnd w:id="53"/>
-    <w:bookmarkStart w:id="54" w:name="ipos-adsp-019"/>
+    <w:bookmarkEnd w:id="56"/>
+    <w:bookmarkStart w:id="57" w:name="ipos-adsp-019"/>
     <w:p>
       <w:pPr>
         <w:pStyle w:val="Heading4"/>
@@ -4478,9 +4440,6 @@
       </w:r>
     </w:p>
     <w:p>
-      <w:pPr>
-        <w:pStyle w:val="FirstParagraph"/>
-      </w:pPr>
       <w:r>
         <w:t xml:space="preserve">If during the start of a new operation, more than one bit is written into CONTROL_A reg in the same write operation, ADSP shall execute only the routine at higher priority and discard the others. Priority is listed below, with first routine at higher priority: 1. SOFT RESET routine 2. OTP WRITE routine 3. OTP TEST routine 4. OTP BOOT routine [Vpriority High]</w:t>
       </w:r>
@@ -4501,9 +4460,9 @@
         <w:t xml:space="preserve">[End]</w:t>
       </w:r>
     </w:p>
-    <w:bookmarkEnd w:id="54"/>
-    <w:bookmarkEnd w:id="55"/>
-    <w:bookmarkEnd w:id="56"/>
+    <w:bookmarkEnd w:id="57"/>
+    <w:bookmarkEnd w:id="58"/>
+    <w:bookmarkEnd w:id="59"/>
     <w:sectPr>
       <w:headerReference r:id="rId14" w:type="default"/>
       <w:footerReference r:id="rId15" w:type="default"/>
@@ -6787,6 +6746,9 @@
     <w:abstractNumId w:val="991"/>
   </w:num>
   <w:num w:numId="1002">
+    <w:abstractNumId w:val="991"/>
+  </w:num>
+  <w:num w:numId="1003">
     <w:abstractNumId w:val="991"/>
   </w:num>
 </w:numbering>

</xml_diff>